<commit_message>
SSU3 izmena jedne reci
</commit_message>
<xml_diff>
--- a/SSU/SSU 3 - Pretraga komponenti.docx
+++ b/SSU/SSU 3 - Pretraga komponenti.docx
@@ -6,50 +6,16 @@
       <w:pPr>
         <w:jc w:val="center"/>
       </w:pPr>
-      <w:proofErr w:type="spellStart"/>
-      <w:r>
-        <w:t>Elektrotehnički</w:t>
-      </w:r>
-      <w:proofErr w:type="spellEnd"/>
-      <w:r>
-        <w:t xml:space="preserve"> </w:t>
-      </w:r>
-      <w:proofErr w:type="spellStart"/>
-      <w:r>
-        <w:t>fakultet</w:t>
-      </w:r>
-      <w:proofErr w:type="spellEnd"/>
-      <w:r>
-        <w:t xml:space="preserve"> u </w:t>
-      </w:r>
-      <w:proofErr w:type="spellStart"/>
-      <w:r>
-        <w:t>Beogradu</w:t>
-      </w:r>
-      <w:proofErr w:type="spellEnd"/>
+      <w:r>
+        <w:t>Elektrotehnički fakultet u Beogradu</w:t>
+      </w:r>
     </w:p>
     <w:p>
       <w:pPr>
         <w:jc w:val="center"/>
       </w:pPr>
       <w:r>
-        <w:t xml:space="preserve">Principi </w:t>
-      </w:r>
-      <w:proofErr w:type="spellStart"/>
-      <w:r>
-        <w:t>Softverskog</w:t>
-      </w:r>
-      <w:proofErr w:type="spellEnd"/>
-      <w:r>
-        <w:t xml:space="preserve"> </w:t>
-      </w:r>
-      <w:proofErr w:type="spellStart"/>
-      <w:r>
-        <w:t>Inženjerstva</w:t>
-      </w:r>
-      <w:proofErr w:type="spellEnd"/>
-      <w:r>
-        <w:t xml:space="preserve"> (SI3PSI)</w:t>
+        <w:t>Principi Softverskog Inženjerstva (SI3PSI)</w:t>
       </w:r>
     </w:p>
     <w:p/>
@@ -83,51 +49,9 @@
         </w:rPr>
         <w:br/>
       </w:r>
-      <w:proofErr w:type="spellStart"/>
-      <w:r>
-        <w:t>Specifikacija</w:t>
-      </w:r>
-      <w:proofErr w:type="spellEnd"/>
-      <w:r>
-        <w:t xml:space="preserve"> </w:t>
-      </w:r>
-      <w:proofErr w:type="spellStart"/>
-      <w:r>
-        <w:t>slučaja</w:t>
-      </w:r>
-      <w:proofErr w:type="spellEnd"/>
-      <w:r>
-        <w:t xml:space="preserve"> </w:t>
-      </w:r>
-      <w:proofErr w:type="spellStart"/>
-      <w:r>
-        <w:t>upotrebe</w:t>
-      </w:r>
-      <w:proofErr w:type="spellEnd"/>
-      <w:r>
-        <w:t xml:space="preserve"> </w:t>
-      </w:r>
-      <w:proofErr w:type="spellStart"/>
-      <w:r>
-        <w:t>funkcionalnosti</w:t>
-      </w:r>
-      <w:proofErr w:type="spellEnd"/>
-      <w:r>
-        <w:t xml:space="preserve"> </w:t>
-      </w:r>
-      <w:proofErr w:type="spellStart"/>
-      <w:r>
-        <w:t>pretrage</w:t>
-      </w:r>
-      <w:proofErr w:type="spellEnd"/>
-      <w:r>
-        <w:t xml:space="preserve"> </w:t>
-      </w:r>
-      <w:proofErr w:type="spellStart"/>
-      <w:r>
-        <w:t>komponenti</w:t>
-      </w:r>
-      <w:proofErr w:type="spellEnd"/>
+      <w:r>
+        <w:t>Specifikacija slučaja upotrebe funkcionalnosti pretrage komponenti</w:t>
+      </w:r>
     </w:p>
     <w:p/>
     <w:p>
@@ -141,21 +65,12 @@
           <w:lang w:val="sr-Latn-RS"/>
         </w:rPr>
       </w:pPr>
-      <w:proofErr w:type="spellStart"/>
-      <w:r>
-        <w:rPr>
-          <w:b/>
-          <w:bCs/>
-        </w:rPr>
-        <w:t>Verzija</w:t>
-      </w:r>
-      <w:proofErr w:type="spellEnd"/>
-      <w:r>
-        <w:rPr>
-          <w:b/>
-          <w:bCs/>
-        </w:rPr>
-        <w:t xml:space="preserve"> 1.0</w:t>
+      <w:r>
+        <w:rPr>
+          <w:b/>
+          <w:bCs/>
+        </w:rPr>
+        <w:t>Verzija 1.0</w:t>
       </w:r>
     </w:p>
     <w:p>
@@ -2212,20 +2127,10 @@
           <w:color w:val="auto"/>
         </w:rPr>
         <w:tab/>
-      </w:r>
-      <w:proofErr w:type="spellStart"/>
-      <w:r>
-        <w:rPr>
-          <w:rStyle w:val="Heading2Char"/>
-          <w:b/>
-          <w:bCs/>
-          <w:color w:val="auto"/>
-        </w:rPr>
         <w:t>Rezime</w:t>
       </w:r>
       <w:bookmarkEnd w:id="3"/>
       <w:bookmarkEnd w:id="4"/>
-      <w:proofErr w:type="spellEnd"/>
       <w:r>
         <w:rPr>
           <w:rStyle w:val="Heading2Char"/>
@@ -2268,100 +2173,10 @@
           <w:color w:val="auto"/>
         </w:rPr>
         <w:tab/>
-      </w:r>
-      <w:proofErr w:type="spellStart"/>
-      <w:r>
-        <w:rPr>
-          <w:rStyle w:val="Heading2Char"/>
-          <w:b/>
-          <w:bCs/>
-          <w:color w:val="auto"/>
-        </w:rPr>
-        <w:t>Namena</w:t>
-      </w:r>
-      <w:proofErr w:type="spellEnd"/>
-      <w:r>
-        <w:rPr>
-          <w:rStyle w:val="Heading2Char"/>
-          <w:b/>
-          <w:bCs/>
-          <w:color w:val="auto"/>
-        </w:rPr>
-        <w:t xml:space="preserve"> </w:t>
-      </w:r>
-      <w:proofErr w:type="spellStart"/>
-      <w:r>
-        <w:rPr>
-          <w:rStyle w:val="Heading2Char"/>
-          <w:b/>
-          <w:bCs/>
-          <w:color w:val="auto"/>
-        </w:rPr>
-        <w:t>dokumenta</w:t>
-      </w:r>
-      <w:proofErr w:type="spellEnd"/>
-      <w:r>
-        <w:rPr>
-          <w:rStyle w:val="Heading2Char"/>
-          <w:b/>
-          <w:bCs/>
-          <w:color w:val="auto"/>
-        </w:rPr>
-        <w:t xml:space="preserve"> </w:t>
-      </w:r>
-      <w:proofErr w:type="spellStart"/>
-      <w:r>
-        <w:rPr>
-          <w:rStyle w:val="Heading2Char"/>
-          <w:b/>
-          <w:bCs/>
-          <w:color w:val="auto"/>
-        </w:rPr>
-        <w:t>i</w:t>
-      </w:r>
-      <w:proofErr w:type="spellEnd"/>
-      <w:r>
-        <w:rPr>
-          <w:rStyle w:val="Heading2Char"/>
-          <w:b/>
-          <w:bCs/>
-          <w:color w:val="auto"/>
-        </w:rPr>
-        <w:t xml:space="preserve"> </w:t>
-      </w:r>
-      <w:proofErr w:type="spellStart"/>
-      <w:r>
-        <w:rPr>
-          <w:rStyle w:val="Heading2Char"/>
-          <w:b/>
-          <w:bCs/>
-          <w:color w:val="auto"/>
-        </w:rPr>
-        <w:t>ciljne</w:t>
-      </w:r>
-      <w:proofErr w:type="spellEnd"/>
-      <w:r>
-        <w:rPr>
-          <w:rStyle w:val="Heading2Char"/>
-          <w:b/>
-          <w:bCs/>
-          <w:color w:val="auto"/>
-        </w:rPr>
-        <w:t xml:space="preserve"> </w:t>
-      </w:r>
-      <w:proofErr w:type="spellStart"/>
-      <w:r>
-        <w:rPr>
-          <w:rStyle w:val="Heading2Char"/>
-          <w:b/>
-          <w:bCs/>
-          <w:color w:val="auto"/>
-        </w:rPr>
-        <w:t>grupe</w:t>
+        <w:t>Namena dokumenta i ciljne grupe</w:t>
       </w:r>
       <w:bookmarkEnd w:id="5"/>
       <w:bookmarkEnd w:id="6"/>
-      <w:proofErr w:type="spellEnd"/>
       <w:r>
         <w:rPr>
           <w:rStyle w:val="Heading2Char"/>
@@ -2496,37 +2311,10 @@
           <w:color w:val="auto"/>
         </w:rPr>
         <w:tab/>
-      </w:r>
-      <w:proofErr w:type="spellStart"/>
-      <w:r>
-        <w:rPr>
-          <w:b/>
-          <w:bCs/>
-          <w:color w:val="auto"/>
-        </w:rPr>
-        <w:t>Otvorena</w:t>
-      </w:r>
-      <w:proofErr w:type="spellEnd"/>
-      <w:r>
-        <w:rPr>
-          <w:b/>
-          <w:bCs/>
-          <w:color w:val="auto"/>
-        </w:rPr>
-        <w:t xml:space="preserve"> </w:t>
-      </w:r>
-      <w:proofErr w:type="spellStart"/>
-      <w:r>
-        <w:rPr>
-          <w:b/>
-          <w:bCs/>
-          <w:color w:val="auto"/>
-        </w:rPr>
-        <w:t>pitanja</w:t>
+        <w:t>Otvorena pitanja</w:t>
       </w:r>
       <w:bookmarkEnd w:id="9"/>
       <w:bookmarkEnd w:id="10"/>
-      <w:proofErr w:type="spellEnd"/>
     </w:p>
     <w:tbl>
       <w:tblPr>
@@ -3007,36 +2795,7 @@
           <w:color w:val="auto"/>
         </w:rPr>
         <w:tab/>
-      </w:r>
-      <w:proofErr w:type="spellStart"/>
-      <w:r>
-        <w:rPr>
-          <w:rStyle w:val="Heading2Char"/>
-          <w:b/>
-          <w:bCs/>
-          <w:color w:val="auto"/>
-        </w:rPr>
-        <w:t>Kratak</w:t>
-      </w:r>
-      <w:proofErr w:type="spellEnd"/>
-      <w:r>
-        <w:rPr>
-          <w:rStyle w:val="Heading2Char"/>
-          <w:b/>
-          <w:bCs/>
-          <w:color w:val="auto"/>
-        </w:rPr>
-        <w:t xml:space="preserve"> </w:t>
-      </w:r>
-      <w:proofErr w:type="spellStart"/>
-      <w:r>
-        <w:rPr>
-          <w:rStyle w:val="Heading2Char"/>
-          <w:b/>
-          <w:bCs/>
-          <w:color w:val="auto"/>
-        </w:rPr>
-        <w:t>opi</w:t>
+        <w:t>Kratak opi</w:t>
       </w:r>
       <w:bookmarkEnd w:id="13"/>
       <w:r>
@@ -3048,7 +2807,6 @@
         </w:rPr>
         <w:t>s</w:t>
       </w:r>
-      <w:proofErr w:type="spellEnd"/>
     </w:p>
     <w:p>
       <w:pPr>
@@ -3098,21 +2856,10 @@
           <w:color w:val="auto"/>
         </w:rPr>
         <w:tab/>
-        <w:t xml:space="preserve">Tok </w:t>
-      </w:r>
-      <w:proofErr w:type="spellStart"/>
-      <w:r>
-        <w:rPr>
-          <w:rStyle w:val="Heading2Char"/>
-          <w:b/>
-          <w:bCs/>
-          <w:color w:val="auto"/>
-        </w:rPr>
-        <w:t>događaja</w:t>
+        <w:t>Tok događaja</w:t>
       </w:r>
       <w:bookmarkEnd w:id="15"/>
       <w:bookmarkEnd w:id="16"/>
-      <w:proofErr w:type="spellEnd"/>
     </w:p>
     <w:p>
       <w:pPr>
@@ -3150,7 +2897,6 @@
         </w:rPr>
         <w:tab/>
       </w:r>
-      <w:proofErr w:type="spellStart"/>
       <w:r>
         <w:rPr>
           <w:rStyle w:val="Heading2Char"/>
@@ -3161,115 +2907,10 @@
           <w:szCs w:val="24"/>
           <w:u w:val="single"/>
         </w:rPr>
-        <w:t>Korisnik</w:t>
-      </w:r>
-      <w:proofErr w:type="spellEnd"/>
-      <w:r>
-        <w:rPr>
-          <w:rStyle w:val="Heading2Char"/>
-          <w:b/>
-          <w:bCs/>
-          <w:color w:val="auto"/>
-          <w:sz w:val="24"/>
-          <w:szCs w:val="24"/>
-          <w:u w:val="single"/>
-        </w:rPr>
-        <w:t xml:space="preserve"> se </w:t>
-      </w:r>
-      <w:proofErr w:type="spellStart"/>
-      <w:r>
-        <w:rPr>
-          <w:rStyle w:val="Heading2Char"/>
-          <w:b/>
-          <w:bCs/>
-          <w:color w:val="auto"/>
-          <w:sz w:val="24"/>
-          <w:szCs w:val="24"/>
-          <w:u w:val="single"/>
-        </w:rPr>
-        <w:t>odlučuje</w:t>
-      </w:r>
-      <w:proofErr w:type="spellEnd"/>
-      <w:r>
-        <w:rPr>
-          <w:rStyle w:val="Heading2Char"/>
-          <w:b/>
-          <w:bCs/>
-          <w:color w:val="auto"/>
-          <w:sz w:val="24"/>
-          <w:szCs w:val="24"/>
-          <w:u w:val="single"/>
-        </w:rPr>
-        <w:t xml:space="preserve"> </w:t>
-      </w:r>
-      <w:proofErr w:type="spellStart"/>
-      <w:r>
-        <w:rPr>
-          <w:rStyle w:val="Heading2Char"/>
-          <w:b/>
-          <w:bCs/>
-          <w:color w:val="auto"/>
-          <w:sz w:val="24"/>
-          <w:szCs w:val="24"/>
-          <w:u w:val="single"/>
-        </w:rPr>
-        <w:t>na</w:t>
-      </w:r>
-      <w:proofErr w:type="spellEnd"/>
-      <w:r>
-        <w:rPr>
-          <w:rStyle w:val="Heading2Char"/>
-          <w:b/>
-          <w:bCs/>
-          <w:color w:val="auto"/>
-          <w:sz w:val="24"/>
-          <w:szCs w:val="24"/>
-          <w:u w:val="single"/>
-        </w:rPr>
-        <w:t xml:space="preserve"> </w:t>
-      </w:r>
-      <w:proofErr w:type="spellStart"/>
-      <w:r>
-        <w:rPr>
-          <w:rStyle w:val="Heading2Char"/>
-          <w:b/>
-          <w:bCs/>
-          <w:color w:val="auto"/>
-          <w:sz w:val="24"/>
-          <w:szCs w:val="24"/>
-          <w:u w:val="single"/>
-        </w:rPr>
-        <w:t>tekstualnu</w:t>
-      </w:r>
-      <w:proofErr w:type="spellEnd"/>
-      <w:r>
-        <w:rPr>
-          <w:rStyle w:val="Heading2Char"/>
-          <w:b/>
-          <w:bCs/>
-          <w:color w:val="auto"/>
-          <w:sz w:val="24"/>
-          <w:szCs w:val="24"/>
-          <w:u w:val="single"/>
-        </w:rPr>
-        <w:t xml:space="preserve"> </w:t>
-      </w:r>
-      <w:proofErr w:type="spellStart"/>
-      <w:r>
-        <w:rPr>
-          <w:rStyle w:val="Heading2Char"/>
-          <w:b/>
-          <w:bCs/>
-          <w:color w:val="auto"/>
-          <w:sz w:val="24"/>
-          <w:szCs w:val="24"/>
-          <w:u w:val="single"/>
-        </w:rPr>
-        <w:t>pretragu</w:t>
+        <w:t>Korisnik se odlučuje na tekstualnu pretragu</w:t>
       </w:r>
       <w:bookmarkStart w:id="18" w:name="_Toc226745009"/>
       <w:bookmarkEnd w:id="17"/>
-      <w:proofErr w:type="spellEnd"/>
     </w:p>
     <w:p>
       <w:pPr>
@@ -3287,9 +2928,8 @@
           <w:sz w:val="24"/>
           <w:szCs w:val="24"/>
         </w:rPr>
-        <w:t xml:space="preserve">1. </w:t>
-      </w:r>
-      <w:proofErr w:type="spellStart"/>
+        <w:t xml:space="preserve">1. Korisnik u tekstualno polje unosi tekst po kom želi da pronađe komponente. </w:t>
+      </w:r>
       <w:r>
         <w:rPr>
           <w:rStyle w:val="Heading2Char"/>
@@ -3297,9 +2937,9 @@
           <w:sz w:val="24"/>
           <w:szCs w:val="24"/>
         </w:rPr>
-        <w:t>Korisnik</w:t>
-      </w:r>
-      <w:proofErr w:type="spellEnd"/>
+        <w:br/>
+        <w:t>2. Korisnik pritiska dugme za pretragu.</w:t>
+      </w:r>
       <w:r>
         <w:rPr>
           <w:rStyle w:val="Heading2Char"/>
@@ -3307,9 +2947,9 @@
           <w:sz w:val="24"/>
           <w:szCs w:val="24"/>
         </w:rPr>
-        <w:t xml:space="preserve"> u </w:t>
-      </w:r>
-      <w:proofErr w:type="spellStart"/>
+        <w:br/>
+        <w:t>2. Iz baze podataka se uzimaju komponente koje u svom imenu ili opisu sadrže dati tekst.</w:t>
+      </w:r>
       <w:r>
         <w:rPr>
           <w:rStyle w:val="Heading2Char"/>
@@ -3317,687 +2957,8 @@
           <w:sz w:val="24"/>
           <w:szCs w:val="24"/>
         </w:rPr>
-        <w:t>tekstualno</w:t>
-      </w:r>
-      <w:proofErr w:type="spellEnd"/>
-      <w:r>
-        <w:rPr>
-          <w:rStyle w:val="Heading2Char"/>
-          <w:color w:val="000000" w:themeColor="dark1"/>
-          <w:sz w:val="24"/>
-          <w:szCs w:val="24"/>
-        </w:rPr>
-        <w:t xml:space="preserve"> polje </w:t>
-      </w:r>
-      <w:proofErr w:type="spellStart"/>
-      <w:r>
-        <w:rPr>
-          <w:rStyle w:val="Heading2Char"/>
-          <w:color w:val="000000" w:themeColor="dark1"/>
-          <w:sz w:val="24"/>
-          <w:szCs w:val="24"/>
-        </w:rPr>
-        <w:t>unosi</w:t>
-      </w:r>
-      <w:proofErr w:type="spellEnd"/>
-      <w:r>
-        <w:rPr>
-          <w:rStyle w:val="Heading2Char"/>
-          <w:color w:val="000000" w:themeColor="dark1"/>
-          <w:sz w:val="24"/>
-          <w:szCs w:val="24"/>
-        </w:rPr>
-        <w:t xml:space="preserve"> </w:t>
-      </w:r>
-      <w:proofErr w:type="spellStart"/>
-      <w:r>
-        <w:rPr>
-          <w:rStyle w:val="Heading2Char"/>
-          <w:color w:val="000000" w:themeColor="dark1"/>
-          <w:sz w:val="24"/>
-          <w:szCs w:val="24"/>
-        </w:rPr>
-        <w:t>tekst</w:t>
-      </w:r>
-      <w:proofErr w:type="spellEnd"/>
-      <w:r>
-        <w:rPr>
-          <w:rStyle w:val="Heading2Char"/>
-          <w:color w:val="000000" w:themeColor="dark1"/>
-          <w:sz w:val="24"/>
-          <w:szCs w:val="24"/>
-        </w:rPr>
-        <w:t xml:space="preserve"> po </w:t>
-      </w:r>
-      <w:proofErr w:type="spellStart"/>
-      <w:r>
-        <w:rPr>
-          <w:rStyle w:val="Heading2Char"/>
-          <w:color w:val="000000" w:themeColor="dark1"/>
-          <w:sz w:val="24"/>
-          <w:szCs w:val="24"/>
-        </w:rPr>
-        <w:t>kom</w:t>
-      </w:r>
-      <w:proofErr w:type="spellEnd"/>
-      <w:r>
-        <w:rPr>
-          <w:rStyle w:val="Heading2Char"/>
-          <w:color w:val="000000" w:themeColor="dark1"/>
-          <w:sz w:val="24"/>
-          <w:szCs w:val="24"/>
-        </w:rPr>
-        <w:t xml:space="preserve"> </w:t>
-      </w:r>
-      <w:proofErr w:type="spellStart"/>
-      <w:r>
-        <w:rPr>
-          <w:rStyle w:val="Heading2Char"/>
-          <w:color w:val="000000" w:themeColor="dark1"/>
-          <w:sz w:val="24"/>
-          <w:szCs w:val="24"/>
-        </w:rPr>
-        <w:t>želi</w:t>
-      </w:r>
-      <w:proofErr w:type="spellEnd"/>
-      <w:r>
-        <w:rPr>
-          <w:rStyle w:val="Heading2Char"/>
-          <w:color w:val="000000" w:themeColor="dark1"/>
-          <w:sz w:val="24"/>
-          <w:szCs w:val="24"/>
-        </w:rPr>
-        <w:t xml:space="preserve"> da </w:t>
-      </w:r>
-      <w:proofErr w:type="spellStart"/>
-      <w:r>
-        <w:rPr>
-          <w:rStyle w:val="Heading2Char"/>
-          <w:color w:val="000000" w:themeColor="dark1"/>
-          <w:sz w:val="24"/>
-          <w:szCs w:val="24"/>
-        </w:rPr>
-        <w:t>pronađe</w:t>
-      </w:r>
-      <w:proofErr w:type="spellEnd"/>
-      <w:r>
-        <w:rPr>
-          <w:rStyle w:val="Heading2Char"/>
-          <w:color w:val="000000" w:themeColor="dark1"/>
-          <w:sz w:val="24"/>
-          <w:szCs w:val="24"/>
-        </w:rPr>
-        <w:t xml:space="preserve"> </w:t>
-      </w:r>
-      <w:proofErr w:type="spellStart"/>
-      <w:r>
-        <w:rPr>
-          <w:rStyle w:val="Heading2Char"/>
-          <w:color w:val="000000" w:themeColor="dark1"/>
-          <w:sz w:val="24"/>
-          <w:szCs w:val="24"/>
-        </w:rPr>
-        <w:t>komponente</w:t>
-      </w:r>
-      <w:proofErr w:type="spellEnd"/>
-      <w:r>
-        <w:rPr>
-          <w:rStyle w:val="Heading2Char"/>
-          <w:color w:val="000000" w:themeColor="dark1"/>
-          <w:sz w:val="24"/>
-          <w:szCs w:val="24"/>
-        </w:rPr>
-        <w:t xml:space="preserve">. </w:t>
-      </w:r>
-      <w:r>
-        <w:rPr>
-          <w:rStyle w:val="Heading2Char"/>
-          <w:color w:val="000000" w:themeColor="dark1"/>
-          <w:sz w:val="24"/>
-          <w:szCs w:val="24"/>
-        </w:rPr>
         <w:br/>
-        <w:t xml:space="preserve">2. </w:t>
-      </w:r>
-      <w:proofErr w:type="spellStart"/>
-      <w:r>
-        <w:rPr>
-          <w:rStyle w:val="Heading2Char"/>
-          <w:color w:val="000000" w:themeColor="dark1"/>
-          <w:sz w:val="24"/>
-          <w:szCs w:val="24"/>
-        </w:rPr>
-        <w:t>Korisnik</w:t>
-      </w:r>
-      <w:proofErr w:type="spellEnd"/>
-      <w:r>
-        <w:rPr>
-          <w:rStyle w:val="Heading2Char"/>
-          <w:color w:val="000000" w:themeColor="dark1"/>
-          <w:sz w:val="24"/>
-          <w:szCs w:val="24"/>
-        </w:rPr>
-        <w:t xml:space="preserve"> </w:t>
-      </w:r>
-      <w:proofErr w:type="spellStart"/>
-      <w:r>
-        <w:rPr>
-          <w:rStyle w:val="Heading2Char"/>
-          <w:color w:val="000000" w:themeColor="dark1"/>
-          <w:sz w:val="24"/>
-          <w:szCs w:val="24"/>
-        </w:rPr>
-        <w:t>pritiska</w:t>
-      </w:r>
-      <w:proofErr w:type="spellEnd"/>
-      <w:r>
-        <w:rPr>
-          <w:rStyle w:val="Heading2Char"/>
-          <w:color w:val="000000" w:themeColor="dark1"/>
-          <w:sz w:val="24"/>
-          <w:szCs w:val="24"/>
-        </w:rPr>
-        <w:t xml:space="preserve"> </w:t>
-      </w:r>
-      <w:proofErr w:type="spellStart"/>
-      <w:r>
-        <w:rPr>
-          <w:rStyle w:val="Heading2Char"/>
-          <w:color w:val="000000" w:themeColor="dark1"/>
-          <w:sz w:val="24"/>
-          <w:szCs w:val="24"/>
-        </w:rPr>
-        <w:t>dugme</w:t>
-      </w:r>
-      <w:proofErr w:type="spellEnd"/>
-      <w:r>
-        <w:rPr>
-          <w:rStyle w:val="Heading2Char"/>
-          <w:color w:val="000000" w:themeColor="dark1"/>
-          <w:sz w:val="24"/>
-          <w:szCs w:val="24"/>
-        </w:rPr>
-        <w:t xml:space="preserve"> za </w:t>
-      </w:r>
-      <w:proofErr w:type="spellStart"/>
-      <w:r>
-        <w:rPr>
-          <w:rStyle w:val="Heading2Char"/>
-          <w:color w:val="000000" w:themeColor="dark1"/>
-          <w:sz w:val="24"/>
-          <w:szCs w:val="24"/>
-        </w:rPr>
-        <w:t>pretragu</w:t>
-      </w:r>
-      <w:proofErr w:type="spellEnd"/>
-      <w:r>
-        <w:rPr>
-          <w:rStyle w:val="Heading2Char"/>
-          <w:color w:val="000000" w:themeColor="dark1"/>
-          <w:sz w:val="24"/>
-          <w:szCs w:val="24"/>
-        </w:rPr>
-        <w:t>.</w:t>
-      </w:r>
-      <w:r>
-        <w:rPr>
-          <w:rStyle w:val="Heading2Char"/>
-          <w:color w:val="000000" w:themeColor="dark1"/>
-          <w:sz w:val="24"/>
-          <w:szCs w:val="24"/>
-        </w:rPr>
-        <w:br/>
-        <w:t xml:space="preserve">2. </w:t>
-      </w:r>
-      <w:proofErr w:type="spellStart"/>
-      <w:r>
-        <w:rPr>
-          <w:rStyle w:val="Heading2Char"/>
-          <w:color w:val="000000" w:themeColor="dark1"/>
-          <w:sz w:val="24"/>
-          <w:szCs w:val="24"/>
-        </w:rPr>
-        <w:t>Iz</w:t>
-      </w:r>
-      <w:proofErr w:type="spellEnd"/>
-      <w:r>
-        <w:rPr>
-          <w:rStyle w:val="Heading2Char"/>
-          <w:color w:val="000000" w:themeColor="dark1"/>
-          <w:sz w:val="24"/>
-          <w:szCs w:val="24"/>
-        </w:rPr>
-        <w:t xml:space="preserve"> </w:t>
-      </w:r>
-      <w:proofErr w:type="spellStart"/>
-      <w:r>
-        <w:rPr>
-          <w:rStyle w:val="Heading2Char"/>
-          <w:color w:val="000000" w:themeColor="dark1"/>
-          <w:sz w:val="24"/>
-          <w:szCs w:val="24"/>
-        </w:rPr>
-        <w:t>baze</w:t>
-      </w:r>
-      <w:proofErr w:type="spellEnd"/>
-      <w:r>
-        <w:rPr>
-          <w:rStyle w:val="Heading2Char"/>
-          <w:color w:val="000000" w:themeColor="dark1"/>
-          <w:sz w:val="24"/>
-          <w:szCs w:val="24"/>
-        </w:rPr>
-        <w:t xml:space="preserve"> </w:t>
-      </w:r>
-      <w:proofErr w:type="spellStart"/>
-      <w:r>
-        <w:rPr>
-          <w:rStyle w:val="Heading2Char"/>
-          <w:color w:val="000000" w:themeColor="dark1"/>
-          <w:sz w:val="24"/>
-          <w:szCs w:val="24"/>
-        </w:rPr>
-        <w:t>podataka</w:t>
-      </w:r>
-      <w:proofErr w:type="spellEnd"/>
-      <w:r>
-        <w:rPr>
-          <w:rStyle w:val="Heading2Char"/>
-          <w:color w:val="000000" w:themeColor="dark1"/>
-          <w:sz w:val="24"/>
-          <w:szCs w:val="24"/>
-        </w:rPr>
-        <w:t xml:space="preserve"> se </w:t>
-      </w:r>
-      <w:proofErr w:type="spellStart"/>
-      <w:r>
-        <w:rPr>
-          <w:rStyle w:val="Heading2Char"/>
-          <w:color w:val="000000" w:themeColor="dark1"/>
-          <w:sz w:val="24"/>
-          <w:szCs w:val="24"/>
-        </w:rPr>
-        <w:t>uzimaju</w:t>
-      </w:r>
-      <w:proofErr w:type="spellEnd"/>
-      <w:r>
-        <w:rPr>
-          <w:rStyle w:val="Heading2Char"/>
-          <w:color w:val="000000" w:themeColor="dark1"/>
-          <w:sz w:val="24"/>
-          <w:szCs w:val="24"/>
-        </w:rPr>
-        <w:t xml:space="preserve"> </w:t>
-      </w:r>
-      <w:proofErr w:type="spellStart"/>
-      <w:r>
-        <w:rPr>
-          <w:rStyle w:val="Heading2Char"/>
-          <w:color w:val="000000" w:themeColor="dark1"/>
-          <w:sz w:val="24"/>
-          <w:szCs w:val="24"/>
-        </w:rPr>
-        <w:t>komponente</w:t>
-      </w:r>
-      <w:proofErr w:type="spellEnd"/>
-      <w:r>
-        <w:rPr>
-          <w:rStyle w:val="Heading2Char"/>
-          <w:color w:val="000000" w:themeColor="dark1"/>
-          <w:sz w:val="24"/>
-          <w:szCs w:val="24"/>
-        </w:rPr>
-        <w:t xml:space="preserve"> </w:t>
-      </w:r>
-      <w:proofErr w:type="spellStart"/>
-      <w:r>
-        <w:rPr>
-          <w:rStyle w:val="Heading2Char"/>
-          <w:color w:val="000000" w:themeColor="dark1"/>
-          <w:sz w:val="24"/>
-          <w:szCs w:val="24"/>
-        </w:rPr>
-        <w:t>koje</w:t>
-      </w:r>
-      <w:proofErr w:type="spellEnd"/>
-      <w:r>
-        <w:rPr>
-          <w:rStyle w:val="Heading2Char"/>
-          <w:color w:val="000000" w:themeColor="dark1"/>
-          <w:sz w:val="24"/>
-          <w:szCs w:val="24"/>
-        </w:rPr>
-        <w:t xml:space="preserve"> u </w:t>
-      </w:r>
-      <w:proofErr w:type="spellStart"/>
-      <w:r>
-        <w:rPr>
-          <w:rStyle w:val="Heading2Char"/>
-          <w:color w:val="000000" w:themeColor="dark1"/>
-          <w:sz w:val="24"/>
-          <w:szCs w:val="24"/>
-        </w:rPr>
-        <w:t>svom</w:t>
-      </w:r>
-      <w:proofErr w:type="spellEnd"/>
-      <w:r>
-        <w:rPr>
-          <w:rStyle w:val="Heading2Char"/>
-          <w:color w:val="000000" w:themeColor="dark1"/>
-          <w:sz w:val="24"/>
-          <w:szCs w:val="24"/>
-        </w:rPr>
-        <w:t xml:space="preserve"> </w:t>
-      </w:r>
-      <w:proofErr w:type="spellStart"/>
-      <w:r>
-        <w:rPr>
-          <w:rStyle w:val="Heading2Char"/>
-          <w:color w:val="000000" w:themeColor="dark1"/>
-          <w:sz w:val="24"/>
-          <w:szCs w:val="24"/>
-        </w:rPr>
-        <w:t>imenu</w:t>
-      </w:r>
-      <w:proofErr w:type="spellEnd"/>
-      <w:r>
-        <w:rPr>
-          <w:rStyle w:val="Heading2Char"/>
-          <w:color w:val="000000" w:themeColor="dark1"/>
-          <w:sz w:val="24"/>
-          <w:szCs w:val="24"/>
-        </w:rPr>
-        <w:t xml:space="preserve"> </w:t>
-      </w:r>
-      <w:proofErr w:type="spellStart"/>
-      <w:r>
-        <w:rPr>
-          <w:rStyle w:val="Heading2Char"/>
-          <w:color w:val="000000" w:themeColor="dark1"/>
-          <w:sz w:val="24"/>
-          <w:szCs w:val="24"/>
-        </w:rPr>
-        <w:t>ili</w:t>
-      </w:r>
-      <w:proofErr w:type="spellEnd"/>
-      <w:r>
-        <w:rPr>
-          <w:rStyle w:val="Heading2Char"/>
-          <w:color w:val="000000" w:themeColor="dark1"/>
-          <w:sz w:val="24"/>
-          <w:szCs w:val="24"/>
-        </w:rPr>
-        <w:t xml:space="preserve"> </w:t>
-      </w:r>
-      <w:proofErr w:type="spellStart"/>
-      <w:r>
-        <w:rPr>
-          <w:rStyle w:val="Heading2Char"/>
-          <w:color w:val="000000" w:themeColor="dark1"/>
-          <w:sz w:val="24"/>
-          <w:szCs w:val="24"/>
-        </w:rPr>
-        <w:t>opisu</w:t>
-      </w:r>
-      <w:proofErr w:type="spellEnd"/>
-      <w:r>
-        <w:rPr>
-          <w:rStyle w:val="Heading2Char"/>
-          <w:color w:val="000000" w:themeColor="dark1"/>
-          <w:sz w:val="24"/>
-          <w:szCs w:val="24"/>
-        </w:rPr>
-        <w:t xml:space="preserve"> </w:t>
-      </w:r>
-      <w:proofErr w:type="spellStart"/>
-      <w:r>
-        <w:rPr>
-          <w:rStyle w:val="Heading2Char"/>
-          <w:color w:val="000000" w:themeColor="dark1"/>
-          <w:sz w:val="24"/>
-          <w:szCs w:val="24"/>
-        </w:rPr>
-        <w:t>sadrže</w:t>
-      </w:r>
-      <w:proofErr w:type="spellEnd"/>
-      <w:r>
-        <w:rPr>
-          <w:rStyle w:val="Heading2Char"/>
-          <w:color w:val="000000" w:themeColor="dark1"/>
-          <w:sz w:val="24"/>
-          <w:szCs w:val="24"/>
-        </w:rPr>
-        <w:t xml:space="preserve"> </w:t>
-      </w:r>
-      <w:proofErr w:type="spellStart"/>
-      <w:r>
-        <w:rPr>
-          <w:rStyle w:val="Heading2Char"/>
-          <w:color w:val="000000" w:themeColor="dark1"/>
-          <w:sz w:val="24"/>
-          <w:szCs w:val="24"/>
-        </w:rPr>
-        <w:t>dati</w:t>
-      </w:r>
-      <w:proofErr w:type="spellEnd"/>
-      <w:r>
-        <w:rPr>
-          <w:rStyle w:val="Heading2Char"/>
-          <w:color w:val="000000" w:themeColor="dark1"/>
-          <w:sz w:val="24"/>
-          <w:szCs w:val="24"/>
-        </w:rPr>
-        <w:t xml:space="preserve"> </w:t>
-      </w:r>
-      <w:proofErr w:type="spellStart"/>
-      <w:r>
-        <w:rPr>
-          <w:rStyle w:val="Heading2Char"/>
-          <w:color w:val="000000" w:themeColor="dark1"/>
-          <w:sz w:val="24"/>
-          <w:szCs w:val="24"/>
-        </w:rPr>
-        <w:t>tekst</w:t>
-      </w:r>
-      <w:proofErr w:type="spellEnd"/>
-      <w:r>
-        <w:rPr>
-          <w:rStyle w:val="Heading2Char"/>
-          <w:color w:val="000000" w:themeColor="dark1"/>
-          <w:sz w:val="24"/>
-          <w:szCs w:val="24"/>
-        </w:rPr>
-        <w:t>.</w:t>
-      </w:r>
-      <w:r>
-        <w:rPr>
-          <w:rStyle w:val="Heading2Char"/>
-          <w:color w:val="000000" w:themeColor="dark1"/>
-          <w:sz w:val="24"/>
-          <w:szCs w:val="24"/>
-        </w:rPr>
-        <w:br/>
-        <w:t xml:space="preserve">3. </w:t>
-      </w:r>
-      <w:proofErr w:type="spellStart"/>
-      <w:r>
-        <w:rPr>
-          <w:rStyle w:val="Heading2Char"/>
-          <w:color w:val="000000" w:themeColor="dark1"/>
-          <w:sz w:val="24"/>
-          <w:szCs w:val="24"/>
-        </w:rPr>
-        <w:t>Korisniku</w:t>
-      </w:r>
-      <w:proofErr w:type="spellEnd"/>
-      <w:r>
-        <w:rPr>
-          <w:rStyle w:val="Heading2Char"/>
-          <w:color w:val="000000" w:themeColor="dark1"/>
-          <w:sz w:val="24"/>
-          <w:szCs w:val="24"/>
-        </w:rPr>
-        <w:t xml:space="preserve"> se </w:t>
-      </w:r>
-      <w:proofErr w:type="spellStart"/>
-      <w:r>
-        <w:rPr>
-          <w:rStyle w:val="Heading2Char"/>
-          <w:color w:val="000000" w:themeColor="dark1"/>
-          <w:sz w:val="24"/>
-          <w:szCs w:val="24"/>
-        </w:rPr>
-        <w:t>na</w:t>
-      </w:r>
-      <w:proofErr w:type="spellEnd"/>
-      <w:r>
-        <w:rPr>
-          <w:rStyle w:val="Heading2Char"/>
-          <w:color w:val="000000" w:themeColor="dark1"/>
-          <w:sz w:val="24"/>
-          <w:szCs w:val="24"/>
-        </w:rPr>
-        <w:t xml:space="preserve"> </w:t>
-      </w:r>
-      <w:proofErr w:type="spellStart"/>
-      <w:r>
-        <w:rPr>
-          <w:rStyle w:val="Heading2Char"/>
-          <w:color w:val="000000" w:themeColor="dark1"/>
-          <w:sz w:val="24"/>
-          <w:szCs w:val="24"/>
-        </w:rPr>
-        <w:t>ekranu</w:t>
-      </w:r>
-      <w:proofErr w:type="spellEnd"/>
-      <w:r>
-        <w:rPr>
-          <w:rStyle w:val="Heading2Char"/>
-          <w:color w:val="000000" w:themeColor="dark1"/>
-          <w:sz w:val="24"/>
-          <w:szCs w:val="24"/>
-        </w:rPr>
-        <w:t xml:space="preserve"> </w:t>
-      </w:r>
-      <w:proofErr w:type="spellStart"/>
-      <w:r>
-        <w:rPr>
-          <w:rStyle w:val="Heading2Char"/>
-          <w:color w:val="000000" w:themeColor="dark1"/>
-          <w:sz w:val="24"/>
-          <w:szCs w:val="24"/>
-        </w:rPr>
-        <w:t>prikazuju</w:t>
-      </w:r>
-      <w:proofErr w:type="spellEnd"/>
-      <w:r>
-        <w:rPr>
-          <w:rStyle w:val="Heading2Char"/>
-          <w:color w:val="000000" w:themeColor="dark1"/>
-          <w:sz w:val="24"/>
-          <w:szCs w:val="24"/>
-        </w:rPr>
-        <w:t xml:space="preserve"> </w:t>
-      </w:r>
-      <w:proofErr w:type="spellStart"/>
-      <w:r>
-        <w:rPr>
-          <w:rStyle w:val="Heading2Char"/>
-          <w:color w:val="000000" w:themeColor="dark1"/>
-          <w:sz w:val="24"/>
-          <w:szCs w:val="24"/>
-        </w:rPr>
-        <w:t>komponente</w:t>
-      </w:r>
-      <w:proofErr w:type="spellEnd"/>
-      <w:r>
-        <w:rPr>
-          <w:rStyle w:val="Heading2Char"/>
-          <w:color w:val="000000" w:themeColor="dark1"/>
-          <w:sz w:val="24"/>
-          <w:szCs w:val="24"/>
-        </w:rPr>
-        <w:t xml:space="preserve"> </w:t>
-      </w:r>
-      <w:proofErr w:type="spellStart"/>
-      <w:r>
-        <w:rPr>
-          <w:rStyle w:val="Heading2Char"/>
-          <w:color w:val="000000" w:themeColor="dark1"/>
-          <w:sz w:val="24"/>
-          <w:szCs w:val="24"/>
-        </w:rPr>
-        <w:t>koje</w:t>
-      </w:r>
-      <w:proofErr w:type="spellEnd"/>
-      <w:r>
-        <w:rPr>
-          <w:rStyle w:val="Heading2Char"/>
-          <w:color w:val="000000" w:themeColor="dark1"/>
-          <w:sz w:val="24"/>
-          <w:szCs w:val="24"/>
-        </w:rPr>
-        <w:t xml:space="preserve"> </w:t>
-      </w:r>
-      <w:proofErr w:type="spellStart"/>
-      <w:r>
-        <w:rPr>
-          <w:rStyle w:val="Heading2Char"/>
-          <w:color w:val="000000" w:themeColor="dark1"/>
-          <w:sz w:val="24"/>
-          <w:szCs w:val="24"/>
-        </w:rPr>
-        <w:t>su</w:t>
-      </w:r>
-      <w:proofErr w:type="spellEnd"/>
-      <w:r>
-        <w:rPr>
-          <w:rStyle w:val="Heading2Char"/>
-          <w:color w:val="000000" w:themeColor="dark1"/>
-          <w:sz w:val="24"/>
-          <w:szCs w:val="24"/>
-        </w:rPr>
-        <w:t xml:space="preserve"> </w:t>
-      </w:r>
-      <w:proofErr w:type="spellStart"/>
-      <w:r>
-        <w:rPr>
-          <w:rStyle w:val="Heading2Char"/>
-          <w:color w:val="000000" w:themeColor="dark1"/>
-          <w:sz w:val="24"/>
-          <w:szCs w:val="24"/>
-        </w:rPr>
-        <w:t>rezultat</w:t>
-      </w:r>
-      <w:proofErr w:type="spellEnd"/>
-      <w:r>
-        <w:rPr>
-          <w:rStyle w:val="Heading2Char"/>
-          <w:color w:val="000000" w:themeColor="dark1"/>
-          <w:sz w:val="24"/>
-          <w:szCs w:val="24"/>
-        </w:rPr>
-        <w:t xml:space="preserve"> </w:t>
-      </w:r>
-      <w:proofErr w:type="spellStart"/>
-      <w:r>
-        <w:rPr>
-          <w:rStyle w:val="Heading2Char"/>
-          <w:color w:val="000000" w:themeColor="dark1"/>
-          <w:sz w:val="24"/>
-          <w:szCs w:val="24"/>
-        </w:rPr>
-        <w:t>pretrage</w:t>
-      </w:r>
-      <w:proofErr w:type="spellEnd"/>
-      <w:r>
-        <w:rPr>
-          <w:rStyle w:val="Heading2Char"/>
-          <w:color w:val="000000" w:themeColor="dark1"/>
-          <w:sz w:val="24"/>
-          <w:szCs w:val="24"/>
-        </w:rPr>
-        <w:t>.</w:t>
+        <w:t>3. Korisniku se na ekranu prikazuju komponente koje su rezultat pretrage.</w:t>
       </w:r>
       <w:bookmarkEnd w:id="18"/>
     </w:p>
@@ -4048,7 +3009,6 @@
         </w:rPr>
         <w:tab/>
       </w:r>
-      <w:proofErr w:type="spellStart"/>
       <w:r>
         <w:rPr>
           <w:rStyle w:val="Heading2Char"/>
@@ -4059,141 +3019,10 @@
           <w:szCs w:val="24"/>
           <w:u w:val="single"/>
         </w:rPr>
-        <w:t>Korisnik</w:t>
-      </w:r>
-      <w:proofErr w:type="spellEnd"/>
-      <w:r>
-        <w:rPr>
-          <w:rStyle w:val="Heading2Char"/>
-          <w:b/>
-          <w:bCs/>
-          <w:color w:val="auto"/>
-          <w:sz w:val="24"/>
-          <w:szCs w:val="24"/>
-          <w:u w:val="single"/>
-        </w:rPr>
-        <w:t xml:space="preserve"> se </w:t>
-      </w:r>
-      <w:proofErr w:type="spellStart"/>
-      <w:r>
-        <w:rPr>
-          <w:rStyle w:val="Heading2Char"/>
-          <w:b/>
-          <w:bCs/>
-          <w:color w:val="auto"/>
-          <w:sz w:val="24"/>
-          <w:szCs w:val="24"/>
-          <w:u w:val="single"/>
-        </w:rPr>
-        <w:t>odlučuje</w:t>
-      </w:r>
-      <w:proofErr w:type="spellEnd"/>
-      <w:r>
-        <w:rPr>
-          <w:rStyle w:val="Heading2Char"/>
-          <w:b/>
-          <w:bCs/>
-          <w:color w:val="auto"/>
-          <w:sz w:val="24"/>
-          <w:szCs w:val="24"/>
-          <w:u w:val="single"/>
-        </w:rPr>
-        <w:t xml:space="preserve"> </w:t>
-      </w:r>
-      <w:proofErr w:type="spellStart"/>
-      <w:r>
-        <w:rPr>
-          <w:rStyle w:val="Heading2Char"/>
-          <w:b/>
-          <w:bCs/>
-          <w:color w:val="auto"/>
-          <w:sz w:val="24"/>
-          <w:szCs w:val="24"/>
-          <w:u w:val="single"/>
-        </w:rPr>
-        <w:t>na</w:t>
-      </w:r>
-      <w:proofErr w:type="spellEnd"/>
-      <w:r>
-        <w:rPr>
-          <w:rStyle w:val="Heading2Char"/>
-          <w:b/>
-          <w:bCs/>
-          <w:color w:val="auto"/>
-          <w:sz w:val="24"/>
-          <w:szCs w:val="24"/>
-          <w:u w:val="single"/>
-        </w:rPr>
-        <w:t xml:space="preserve"> </w:t>
-      </w:r>
-      <w:proofErr w:type="spellStart"/>
-      <w:r>
-        <w:rPr>
-          <w:rStyle w:val="Heading2Char"/>
-          <w:b/>
-          <w:bCs/>
-          <w:color w:val="auto"/>
-          <w:sz w:val="24"/>
-          <w:szCs w:val="24"/>
-          <w:u w:val="single"/>
-        </w:rPr>
-        <w:t>pretragu</w:t>
-      </w:r>
-      <w:proofErr w:type="spellEnd"/>
-      <w:r>
-        <w:rPr>
-          <w:rStyle w:val="Heading2Char"/>
-          <w:b/>
-          <w:bCs/>
-          <w:color w:val="auto"/>
-          <w:sz w:val="24"/>
-          <w:szCs w:val="24"/>
-          <w:u w:val="single"/>
-        </w:rPr>
-        <w:t xml:space="preserve"> </w:t>
-      </w:r>
-      <w:proofErr w:type="spellStart"/>
-      <w:r>
-        <w:rPr>
-          <w:rStyle w:val="Heading2Char"/>
-          <w:b/>
-          <w:bCs/>
-          <w:color w:val="auto"/>
-          <w:sz w:val="24"/>
-          <w:szCs w:val="24"/>
-          <w:u w:val="single"/>
-        </w:rPr>
-        <w:t>pomoću</w:t>
-      </w:r>
-      <w:proofErr w:type="spellEnd"/>
-      <w:r>
-        <w:rPr>
-          <w:rStyle w:val="Heading2Char"/>
-          <w:b/>
-          <w:bCs/>
-          <w:color w:val="auto"/>
-          <w:sz w:val="24"/>
-          <w:szCs w:val="24"/>
-          <w:u w:val="single"/>
-        </w:rPr>
-        <w:t xml:space="preserve"> </w:t>
-      </w:r>
-      <w:proofErr w:type="spellStart"/>
-      <w:r>
-        <w:rPr>
-          <w:rStyle w:val="Heading2Char"/>
-          <w:b/>
-          <w:bCs/>
-          <w:color w:val="auto"/>
-          <w:sz w:val="24"/>
-          <w:szCs w:val="24"/>
-          <w:u w:val="single"/>
-        </w:rPr>
-        <w:t>filtera</w:t>
+        <w:t>Korisnik se odlučuje na pretragu pomoću filtera</w:t>
       </w:r>
       <w:bookmarkStart w:id="20" w:name="_Toc226745011"/>
       <w:bookmarkEnd w:id="19"/>
-      <w:proofErr w:type="spellEnd"/>
       <w:r>
         <w:rPr>
           <w:rStyle w:val="Heading2Char"/>
@@ -4219,9 +3048,8 @@
           <w:sz w:val="24"/>
           <w:szCs w:val="24"/>
         </w:rPr>
-        <w:t xml:space="preserve">. </w:t>
-      </w:r>
-      <w:proofErr w:type="spellStart"/>
+        <w:t>. Korisnik klikom na kriterijume za filtriranje odabira koje od njih želi da iskoristi pri filtriranju.</w:t>
+      </w:r>
       <w:r>
         <w:rPr>
           <w:rStyle w:val="Heading2Char"/>
@@ -4229,9 +3057,8 @@
           <w:sz w:val="24"/>
           <w:szCs w:val="24"/>
         </w:rPr>
-        <w:t>Korisnik</w:t>
-      </w:r>
-      <w:proofErr w:type="spellEnd"/>
+        <w:br/>
+      </w:r>
       <w:r>
         <w:rPr>
           <w:rStyle w:val="Heading2Char"/>
@@ -4239,9 +3066,8 @@
           <w:sz w:val="24"/>
           <w:szCs w:val="24"/>
         </w:rPr>
-        <w:t xml:space="preserve"> </w:t>
-      </w:r>
-      <w:proofErr w:type="spellStart"/>
+        <w:t>2</w:t>
+      </w:r>
       <w:r>
         <w:rPr>
           <w:rStyle w:val="Heading2Char"/>
@@ -4249,9 +3075,8 @@
           <w:sz w:val="24"/>
           <w:szCs w:val="24"/>
         </w:rPr>
-        <w:t>klikom</w:t>
-      </w:r>
-      <w:proofErr w:type="spellEnd"/>
+        <w:t xml:space="preserve">. Korisnik pritiska dugme za </w:t>
+      </w:r>
       <w:r>
         <w:rPr>
           <w:rStyle w:val="Heading2Char"/>
@@ -4259,9 +3084,8 @@
           <w:sz w:val="24"/>
           <w:szCs w:val="24"/>
         </w:rPr>
-        <w:t xml:space="preserve"> </w:t>
-      </w:r>
-      <w:proofErr w:type="spellStart"/>
+        <w:t>filtriranje</w:t>
+      </w:r>
       <w:r>
         <w:rPr>
           <w:rStyle w:val="Heading2Char"/>
@@ -4269,9 +3093,8 @@
           <w:sz w:val="24"/>
           <w:szCs w:val="24"/>
         </w:rPr>
-        <w:t>na</w:t>
-      </w:r>
-      <w:proofErr w:type="spellEnd"/>
+        <w:t>.</w:t>
+      </w:r>
       <w:r>
         <w:rPr>
           <w:rStyle w:val="Heading2Char"/>
@@ -4279,9 +3102,8 @@
           <w:sz w:val="24"/>
           <w:szCs w:val="24"/>
         </w:rPr>
-        <w:t xml:space="preserve"> </w:t>
-      </w:r>
-      <w:proofErr w:type="spellStart"/>
+        <w:br/>
+      </w:r>
       <w:r>
         <w:rPr>
           <w:rStyle w:val="Heading2Char"/>
@@ -4289,9 +3111,8 @@
           <w:sz w:val="24"/>
           <w:szCs w:val="24"/>
         </w:rPr>
-        <w:t>kriterijume</w:t>
-      </w:r>
-      <w:proofErr w:type="spellEnd"/>
+        <w:t>3</w:t>
+      </w:r>
       <w:r>
         <w:rPr>
           <w:rStyle w:val="Heading2Char"/>
@@ -4299,9 +3120,8 @@
           <w:sz w:val="24"/>
           <w:szCs w:val="24"/>
         </w:rPr>
-        <w:t xml:space="preserve"> za </w:t>
-      </w:r>
-      <w:proofErr w:type="spellStart"/>
+        <w:t>. Iz baze podataka se uzimaju komponente koje zadovoljavaju navedene kriterijume.</w:t>
+      </w:r>
       <w:r>
         <w:rPr>
           <w:rStyle w:val="Heading2Char"/>
@@ -4309,9 +3129,8 @@
           <w:sz w:val="24"/>
           <w:szCs w:val="24"/>
         </w:rPr>
-        <w:t>filtriranje</w:t>
-      </w:r>
-      <w:proofErr w:type="spellEnd"/>
+        <w:br/>
+      </w:r>
       <w:r>
         <w:rPr>
           <w:rStyle w:val="Heading2Char"/>
@@ -4319,9 +3138,8 @@
           <w:sz w:val="24"/>
           <w:szCs w:val="24"/>
         </w:rPr>
-        <w:t xml:space="preserve"> </w:t>
-      </w:r>
-      <w:proofErr w:type="spellStart"/>
+        <w:t>4</w:t>
+      </w:r>
       <w:r>
         <w:rPr>
           <w:rStyle w:val="Heading2Char"/>
@@ -4329,678 +3147,7 @@
           <w:sz w:val="24"/>
           <w:szCs w:val="24"/>
         </w:rPr>
-        <w:t>odabira</w:t>
-      </w:r>
-      <w:proofErr w:type="spellEnd"/>
-      <w:r>
-        <w:rPr>
-          <w:rStyle w:val="Heading2Char"/>
-          <w:color w:val="000000" w:themeColor="dark1"/>
-          <w:sz w:val="24"/>
-          <w:szCs w:val="24"/>
-        </w:rPr>
-        <w:t xml:space="preserve"> </w:t>
-      </w:r>
-      <w:proofErr w:type="spellStart"/>
-      <w:r>
-        <w:rPr>
-          <w:rStyle w:val="Heading2Char"/>
-          <w:color w:val="000000" w:themeColor="dark1"/>
-          <w:sz w:val="24"/>
-          <w:szCs w:val="24"/>
-        </w:rPr>
-        <w:t>koje</w:t>
-      </w:r>
-      <w:proofErr w:type="spellEnd"/>
-      <w:r>
-        <w:rPr>
-          <w:rStyle w:val="Heading2Char"/>
-          <w:color w:val="000000" w:themeColor="dark1"/>
-          <w:sz w:val="24"/>
-          <w:szCs w:val="24"/>
-        </w:rPr>
-        <w:t xml:space="preserve"> </w:t>
-      </w:r>
-      <w:proofErr w:type="spellStart"/>
-      <w:r>
-        <w:rPr>
-          <w:rStyle w:val="Heading2Char"/>
-          <w:color w:val="000000" w:themeColor="dark1"/>
-          <w:sz w:val="24"/>
-          <w:szCs w:val="24"/>
-        </w:rPr>
-        <w:t>od</w:t>
-      </w:r>
-      <w:proofErr w:type="spellEnd"/>
-      <w:r>
-        <w:rPr>
-          <w:rStyle w:val="Heading2Char"/>
-          <w:color w:val="000000" w:themeColor="dark1"/>
-          <w:sz w:val="24"/>
-          <w:szCs w:val="24"/>
-        </w:rPr>
-        <w:t xml:space="preserve"> </w:t>
-      </w:r>
-      <w:proofErr w:type="spellStart"/>
-      <w:r>
-        <w:rPr>
-          <w:rStyle w:val="Heading2Char"/>
-          <w:color w:val="000000" w:themeColor="dark1"/>
-          <w:sz w:val="24"/>
-          <w:szCs w:val="24"/>
-        </w:rPr>
-        <w:t>njih</w:t>
-      </w:r>
-      <w:proofErr w:type="spellEnd"/>
-      <w:r>
-        <w:rPr>
-          <w:rStyle w:val="Heading2Char"/>
-          <w:color w:val="000000" w:themeColor="dark1"/>
-          <w:sz w:val="24"/>
-          <w:szCs w:val="24"/>
-        </w:rPr>
-        <w:t xml:space="preserve"> </w:t>
-      </w:r>
-      <w:proofErr w:type="spellStart"/>
-      <w:r>
-        <w:rPr>
-          <w:rStyle w:val="Heading2Char"/>
-          <w:color w:val="000000" w:themeColor="dark1"/>
-          <w:sz w:val="24"/>
-          <w:szCs w:val="24"/>
-        </w:rPr>
-        <w:t>želi</w:t>
-      </w:r>
-      <w:proofErr w:type="spellEnd"/>
-      <w:r>
-        <w:rPr>
-          <w:rStyle w:val="Heading2Char"/>
-          <w:color w:val="000000" w:themeColor="dark1"/>
-          <w:sz w:val="24"/>
-          <w:szCs w:val="24"/>
-        </w:rPr>
-        <w:t xml:space="preserve"> da </w:t>
-      </w:r>
-      <w:proofErr w:type="spellStart"/>
-      <w:r>
-        <w:rPr>
-          <w:rStyle w:val="Heading2Char"/>
-          <w:color w:val="000000" w:themeColor="dark1"/>
-          <w:sz w:val="24"/>
-          <w:szCs w:val="24"/>
-        </w:rPr>
-        <w:t>iskoristi</w:t>
-      </w:r>
-      <w:proofErr w:type="spellEnd"/>
-      <w:r>
-        <w:rPr>
-          <w:rStyle w:val="Heading2Char"/>
-          <w:color w:val="000000" w:themeColor="dark1"/>
-          <w:sz w:val="24"/>
-          <w:szCs w:val="24"/>
-        </w:rPr>
-        <w:t xml:space="preserve"> </w:t>
-      </w:r>
-      <w:proofErr w:type="spellStart"/>
-      <w:r>
-        <w:rPr>
-          <w:rStyle w:val="Heading2Char"/>
-          <w:color w:val="000000" w:themeColor="dark1"/>
-          <w:sz w:val="24"/>
-          <w:szCs w:val="24"/>
-        </w:rPr>
-        <w:t>pri</w:t>
-      </w:r>
-      <w:proofErr w:type="spellEnd"/>
-      <w:r>
-        <w:rPr>
-          <w:rStyle w:val="Heading2Char"/>
-          <w:color w:val="000000" w:themeColor="dark1"/>
-          <w:sz w:val="24"/>
-          <w:szCs w:val="24"/>
-        </w:rPr>
-        <w:t xml:space="preserve"> </w:t>
-      </w:r>
-      <w:proofErr w:type="spellStart"/>
-      <w:r>
-        <w:rPr>
-          <w:rStyle w:val="Heading2Char"/>
-          <w:color w:val="000000" w:themeColor="dark1"/>
-          <w:sz w:val="24"/>
-          <w:szCs w:val="24"/>
-        </w:rPr>
-        <w:t>filtriranju</w:t>
-      </w:r>
-      <w:proofErr w:type="spellEnd"/>
-      <w:r>
-        <w:rPr>
-          <w:rStyle w:val="Heading2Char"/>
-          <w:color w:val="000000" w:themeColor="dark1"/>
-          <w:sz w:val="24"/>
-          <w:szCs w:val="24"/>
-        </w:rPr>
-        <w:t>.</w:t>
-      </w:r>
-      <w:r>
-        <w:rPr>
-          <w:rStyle w:val="Heading2Char"/>
-          <w:color w:val="000000" w:themeColor="dark1"/>
-          <w:sz w:val="24"/>
-          <w:szCs w:val="24"/>
-        </w:rPr>
-        <w:br/>
-      </w:r>
-      <w:r>
-        <w:rPr>
-          <w:rStyle w:val="Heading2Char"/>
-          <w:color w:val="000000" w:themeColor="dark1"/>
-          <w:sz w:val="24"/>
-          <w:szCs w:val="24"/>
-        </w:rPr>
-        <w:t>2</w:t>
-      </w:r>
-      <w:r>
-        <w:rPr>
-          <w:rStyle w:val="Heading2Char"/>
-          <w:color w:val="000000" w:themeColor="dark1"/>
-          <w:sz w:val="24"/>
-          <w:szCs w:val="24"/>
-        </w:rPr>
-        <w:t xml:space="preserve">. </w:t>
-      </w:r>
-      <w:proofErr w:type="spellStart"/>
-      <w:r>
-        <w:rPr>
-          <w:rStyle w:val="Heading2Char"/>
-          <w:color w:val="000000" w:themeColor="dark1"/>
-          <w:sz w:val="24"/>
-          <w:szCs w:val="24"/>
-        </w:rPr>
-        <w:t>Korisnik</w:t>
-      </w:r>
-      <w:proofErr w:type="spellEnd"/>
-      <w:r>
-        <w:rPr>
-          <w:rStyle w:val="Heading2Char"/>
-          <w:color w:val="000000" w:themeColor="dark1"/>
-          <w:sz w:val="24"/>
-          <w:szCs w:val="24"/>
-        </w:rPr>
-        <w:t xml:space="preserve"> </w:t>
-      </w:r>
-      <w:proofErr w:type="spellStart"/>
-      <w:r>
-        <w:rPr>
-          <w:rStyle w:val="Heading2Char"/>
-          <w:color w:val="000000" w:themeColor="dark1"/>
-          <w:sz w:val="24"/>
-          <w:szCs w:val="24"/>
-        </w:rPr>
-        <w:t>pritiska</w:t>
-      </w:r>
-      <w:proofErr w:type="spellEnd"/>
-      <w:r>
-        <w:rPr>
-          <w:rStyle w:val="Heading2Char"/>
-          <w:color w:val="000000" w:themeColor="dark1"/>
-          <w:sz w:val="24"/>
-          <w:szCs w:val="24"/>
-        </w:rPr>
-        <w:t xml:space="preserve"> </w:t>
-      </w:r>
-      <w:proofErr w:type="spellStart"/>
-      <w:r>
-        <w:rPr>
-          <w:rStyle w:val="Heading2Char"/>
-          <w:color w:val="000000" w:themeColor="dark1"/>
-          <w:sz w:val="24"/>
-          <w:szCs w:val="24"/>
-        </w:rPr>
-        <w:t>dugme</w:t>
-      </w:r>
-      <w:proofErr w:type="spellEnd"/>
-      <w:r>
-        <w:rPr>
-          <w:rStyle w:val="Heading2Char"/>
-          <w:color w:val="000000" w:themeColor="dark1"/>
-          <w:sz w:val="24"/>
-          <w:szCs w:val="24"/>
-        </w:rPr>
-        <w:t xml:space="preserve"> za </w:t>
-      </w:r>
-      <w:proofErr w:type="spellStart"/>
-      <w:r>
-        <w:rPr>
-          <w:rStyle w:val="Heading2Char"/>
-          <w:color w:val="000000" w:themeColor="dark1"/>
-          <w:sz w:val="24"/>
-          <w:szCs w:val="24"/>
-        </w:rPr>
-        <w:t>pretragu</w:t>
-      </w:r>
-      <w:proofErr w:type="spellEnd"/>
-      <w:r>
-        <w:rPr>
-          <w:rStyle w:val="Heading2Char"/>
-          <w:color w:val="000000" w:themeColor="dark1"/>
-          <w:sz w:val="24"/>
-          <w:szCs w:val="24"/>
-        </w:rPr>
-        <w:t>.</w:t>
-      </w:r>
-      <w:r>
-        <w:rPr>
-          <w:rStyle w:val="Heading2Char"/>
-          <w:color w:val="000000" w:themeColor="dark1"/>
-          <w:sz w:val="24"/>
-          <w:szCs w:val="24"/>
-        </w:rPr>
-        <w:br/>
-      </w:r>
-      <w:r>
-        <w:rPr>
-          <w:rStyle w:val="Heading2Char"/>
-          <w:color w:val="000000" w:themeColor="dark1"/>
-          <w:sz w:val="24"/>
-          <w:szCs w:val="24"/>
-        </w:rPr>
-        <w:t>3</w:t>
-      </w:r>
-      <w:r>
-        <w:rPr>
-          <w:rStyle w:val="Heading2Char"/>
-          <w:color w:val="000000" w:themeColor="dark1"/>
-          <w:sz w:val="24"/>
-          <w:szCs w:val="24"/>
-        </w:rPr>
-        <w:t xml:space="preserve">. </w:t>
-      </w:r>
-      <w:proofErr w:type="spellStart"/>
-      <w:r>
-        <w:rPr>
-          <w:rStyle w:val="Heading2Char"/>
-          <w:color w:val="000000" w:themeColor="dark1"/>
-          <w:sz w:val="24"/>
-          <w:szCs w:val="24"/>
-        </w:rPr>
-        <w:t>Iz</w:t>
-      </w:r>
-      <w:proofErr w:type="spellEnd"/>
-      <w:r>
-        <w:rPr>
-          <w:rStyle w:val="Heading2Char"/>
-          <w:color w:val="000000" w:themeColor="dark1"/>
-          <w:sz w:val="24"/>
-          <w:szCs w:val="24"/>
-        </w:rPr>
-        <w:t xml:space="preserve"> </w:t>
-      </w:r>
-      <w:proofErr w:type="spellStart"/>
-      <w:r>
-        <w:rPr>
-          <w:rStyle w:val="Heading2Char"/>
-          <w:color w:val="000000" w:themeColor="dark1"/>
-          <w:sz w:val="24"/>
-          <w:szCs w:val="24"/>
-        </w:rPr>
-        <w:t>baze</w:t>
-      </w:r>
-      <w:proofErr w:type="spellEnd"/>
-      <w:r>
-        <w:rPr>
-          <w:rStyle w:val="Heading2Char"/>
-          <w:color w:val="000000" w:themeColor="dark1"/>
-          <w:sz w:val="24"/>
-          <w:szCs w:val="24"/>
-        </w:rPr>
-        <w:t xml:space="preserve"> </w:t>
-      </w:r>
-      <w:proofErr w:type="spellStart"/>
-      <w:r>
-        <w:rPr>
-          <w:rStyle w:val="Heading2Char"/>
-          <w:color w:val="000000" w:themeColor="dark1"/>
-          <w:sz w:val="24"/>
-          <w:szCs w:val="24"/>
-        </w:rPr>
-        <w:t>podataka</w:t>
-      </w:r>
-      <w:proofErr w:type="spellEnd"/>
-      <w:r>
-        <w:rPr>
-          <w:rStyle w:val="Heading2Char"/>
-          <w:color w:val="000000" w:themeColor="dark1"/>
-          <w:sz w:val="24"/>
-          <w:szCs w:val="24"/>
-        </w:rPr>
-        <w:t xml:space="preserve"> se </w:t>
-      </w:r>
-      <w:proofErr w:type="spellStart"/>
-      <w:r>
-        <w:rPr>
-          <w:rStyle w:val="Heading2Char"/>
-          <w:color w:val="000000" w:themeColor="dark1"/>
-          <w:sz w:val="24"/>
-          <w:szCs w:val="24"/>
-        </w:rPr>
-        <w:t>uzimaju</w:t>
-      </w:r>
-      <w:proofErr w:type="spellEnd"/>
-      <w:r>
-        <w:rPr>
-          <w:rStyle w:val="Heading2Char"/>
-          <w:color w:val="000000" w:themeColor="dark1"/>
-          <w:sz w:val="24"/>
-          <w:szCs w:val="24"/>
-        </w:rPr>
-        <w:t xml:space="preserve"> </w:t>
-      </w:r>
-      <w:proofErr w:type="spellStart"/>
-      <w:r>
-        <w:rPr>
-          <w:rStyle w:val="Heading2Char"/>
-          <w:color w:val="000000" w:themeColor="dark1"/>
-          <w:sz w:val="24"/>
-          <w:szCs w:val="24"/>
-        </w:rPr>
-        <w:t>komponente</w:t>
-      </w:r>
-      <w:proofErr w:type="spellEnd"/>
-      <w:r>
-        <w:rPr>
-          <w:rStyle w:val="Heading2Char"/>
-          <w:color w:val="000000" w:themeColor="dark1"/>
-          <w:sz w:val="24"/>
-          <w:szCs w:val="24"/>
-        </w:rPr>
-        <w:t xml:space="preserve"> </w:t>
-      </w:r>
-      <w:proofErr w:type="spellStart"/>
-      <w:r>
-        <w:rPr>
-          <w:rStyle w:val="Heading2Char"/>
-          <w:color w:val="000000" w:themeColor="dark1"/>
-          <w:sz w:val="24"/>
-          <w:szCs w:val="24"/>
-        </w:rPr>
-        <w:t>koje</w:t>
-      </w:r>
-      <w:proofErr w:type="spellEnd"/>
-      <w:r>
-        <w:rPr>
-          <w:rStyle w:val="Heading2Char"/>
-          <w:color w:val="000000" w:themeColor="dark1"/>
-          <w:sz w:val="24"/>
-          <w:szCs w:val="24"/>
-        </w:rPr>
-        <w:t xml:space="preserve"> </w:t>
-      </w:r>
-      <w:proofErr w:type="spellStart"/>
-      <w:r>
-        <w:rPr>
-          <w:rStyle w:val="Heading2Char"/>
-          <w:color w:val="000000" w:themeColor="dark1"/>
-          <w:sz w:val="24"/>
-          <w:szCs w:val="24"/>
-        </w:rPr>
-        <w:t>zadovoljavaju</w:t>
-      </w:r>
-      <w:proofErr w:type="spellEnd"/>
-      <w:r>
-        <w:rPr>
-          <w:rStyle w:val="Heading2Char"/>
-          <w:color w:val="000000" w:themeColor="dark1"/>
-          <w:sz w:val="24"/>
-          <w:szCs w:val="24"/>
-        </w:rPr>
-        <w:t xml:space="preserve"> </w:t>
-      </w:r>
-      <w:proofErr w:type="spellStart"/>
-      <w:r>
-        <w:rPr>
-          <w:rStyle w:val="Heading2Char"/>
-          <w:color w:val="000000" w:themeColor="dark1"/>
-          <w:sz w:val="24"/>
-          <w:szCs w:val="24"/>
-        </w:rPr>
-        <w:t>navedene</w:t>
-      </w:r>
-      <w:proofErr w:type="spellEnd"/>
-      <w:r>
-        <w:rPr>
-          <w:rStyle w:val="Heading2Char"/>
-          <w:color w:val="000000" w:themeColor="dark1"/>
-          <w:sz w:val="24"/>
-          <w:szCs w:val="24"/>
-        </w:rPr>
-        <w:t xml:space="preserve"> </w:t>
-      </w:r>
-      <w:proofErr w:type="spellStart"/>
-      <w:r>
-        <w:rPr>
-          <w:rStyle w:val="Heading2Char"/>
-          <w:color w:val="000000" w:themeColor="dark1"/>
-          <w:sz w:val="24"/>
-          <w:szCs w:val="24"/>
-        </w:rPr>
-        <w:t>kriterijume</w:t>
-      </w:r>
-      <w:proofErr w:type="spellEnd"/>
-      <w:r>
-        <w:rPr>
-          <w:rStyle w:val="Heading2Char"/>
-          <w:color w:val="000000" w:themeColor="dark1"/>
-          <w:sz w:val="24"/>
-          <w:szCs w:val="24"/>
-        </w:rPr>
-        <w:t>.</w:t>
-      </w:r>
-      <w:r>
-        <w:rPr>
-          <w:rStyle w:val="Heading2Char"/>
-          <w:color w:val="000000" w:themeColor="dark1"/>
-          <w:sz w:val="24"/>
-          <w:szCs w:val="24"/>
-        </w:rPr>
-        <w:br/>
-      </w:r>
-      <w:r>
-        <w:rPr>
-          <w:rStyle w:val="Heading2Char"/>
-          <w:color w:val="000000" w:themeColor="dark1"/>
-          <w:sz w:val="24"/>
-          <w:szCs w:val="24"/>
-        </w:rPr>
-        <w:t>4</w:t>
-      </w:r>
-      <w:r>
-        <w:rPr>
-          <w:rStyle w:val="Heading2Char"/>
-          <w:color w:val="000000" w:themeColor="dark1"/>
-          <w:sz w:val="24"/>
-          <w:szCs w:val="24"/>
-        </w:rPr>
-        <w:t xml:space="preserve">. </w:t>
-      </w:r>
-      <w:proofErr w:type="spellStart"/>
-      <w:r>
-        <w:rPr>
-          <w:rStyle w:val="Heading2Char"/>
-          <w:color w:val="000000" w:themeColor="dark1"/>
-          <w:sz w:val="24"/>
-          <w:szCs w:val="24"/>
-        </w:rPr>
-        <w:t>Korisniku</w:t>
-      </w:r>
-      <w:proofErr w:type="spellEnd"/>
-      <w:r>
-        <w:rPr>
-          <w:rStyle w:val="Heading2Char"/>
-          <w:color w:val="000000" w:themeColor="dark1"/>
-          <w:sz w:val="24"/>
-          <w:szCs w:val="24"/>
-        </w:rPr>
-        <w:t xml:space="preserve"> se </w:t>
-      </w:r>
-      <w:proofErr w:type="spellStart"/>
-      <w:r>
-        <w:rPr>
-          <w:rStyle w:val="Heading2Char"/>
-          <w:color w:val="000000" w:themeColor="dark1"/>
-          <w:sz w:val="24"/>
-          <w:szCs w:val="24"/>
-        </w:rPr>
-        <w:t>na</w:t>
-      </w:r>
-      <w:proofErr w:type="spellEnd"/>
-      <w:r>
-        <w:rPr>
-          <w:rStyle w:val="Heading2Char"/>
-          <w:color w:val="000000" w:themeColor="dark1"/>
-          <w:sz w:val="24"/>
-          <w:szCs w:val="24"/>
-        </w:rPr>
-        <w:t xml:space="preserve"> </w:t>
-      </w:r>
-      <w:proofErr w:type="spellStart"/>
-      <w:r>
-        <w:rPr>
-          <w:rStyle w:val="Heading2Char"/>
-          <w:color w:val="000000" w:themeColor="dark1"/>
-          <w:sz w:val="24"/>
-          <w:szCs w:val="24"/>
-        </w:rPr>
-        <w:t>ekranu</w:t>
-      </w:r>
-      <w:proofErr w:type="spellEnd"/>
-      <w:r>
-        <w:rPr>
-          <w:rStyle w:val="Heading2Char"/>
-          <w:color w:val="000000" w:themeColor="dark1"/>
-          <w:sz w:val="24"/>
-          <w:szCs w:val="24"/>
-        </w:rPr>
-        <w:t xml:space="preserve"> </w:t>
-      </w:r>
-      <w:proofErr w:type="spellStart"/>
-      <w:r>
-        <w:rPr>
-          <w:rStyle w:val="Heading2Char"/>
-          <w:color w:val="000000" w:themeColor="dark1"/>
-          <w:sz w:val="24"/>
-          <w:szCs w:val="24"/>
-        </w:rPr>
-        <w:t>prikazuju</w:t>
-      </w:r>
-      <w:proofErr w:type="spellEnd"/>
-      <w:r>
-        <w:rPr>
-          <w:rStyle w:val="Heading2Char"/>
-          <w:color w:val="000000" w:themeColor="dark1"/>
-          <w:sz w:val="24"/>
-          <w:szCs w:val="24"/>
-        </w:rPr>
-        <w:t xml:space="preserve"> </w:t>
-      </w:r>
-      <w:proofErr w:type="spellStart"/>
-      <w:r>
-        <w:rPr>
-          <w:rStyle w:val="Heading2Char"/>
-          <w:color w:val="000000" w:themeColor="dark1"/>
-          <w:sz w:val="24"/>
-          <w:szCs w:val="24"/>
-        </w:rPr>
-        <w:t>komponente</w:t>
-      </w:r>
-      <w:proofErr w:type="spellEnd"/>
-      <w:r>
-        <w:rPr>
-          <w:rStyle w:val="Heading2Char"/>
-          <w:color w:val="000000" w:themeColor="dark1"/>
-          <w:sz w:val="24"/>
-          <w:szCs w:val="24"/>
-        </w:rPr>
-        <w:t xml:space="preserve"> </w:t>
-      </w:r>
-      <w:proofErr w:type="spellStart"/>
-      <w:r>
-        <w:rPr>
-          <w:rStyle w:val="Heading2Char"/>
-          <w:color w:val="000000" w:themeColor="dark1"/>
-          <w:sz w:val="24"/>
-          <w:szCs w:val="24"/>
-        </w:rPr>
-        <w:t>koje</w:t>
-      </w:r>
-      <w:proofErr w:type="spellEnd"/>
-      <w:r>
-        <w:rPr>
-          <w:rStyle w:val="Heading2Char"/>
-          <w:color w:val="000000" w:themeColor="dark1"/>
-          <w:sz w:val="24"/>
-          <w:szCs w:val="24"/>
-        </w:rPr>
-        <w:t xml:space="preserve"> </w:t>
-      </w:r>
-      <w:proofErr w:type="spellStart"/>
-      <w:r>
-        <w:rPr>
-          <w:rStyle w:val="Heading2Char"/>
-          <w:color w:val="000000" w:themeColor="dark1"/>
-          <w:sz w:val="24"/>
-          <w:szCs w:val="24"/>
-        </w:rPr>
-        <w:t>ispunjavaju</w:t>
-      </w:r>
-      <w:proofErr w:type="spellEnd"/>
-      <w:r>
-        <w:rPr>
-          <w:rStyle w:val="Heading2Char"/>
-          <w:color w:val="000000" w:themeColor="dark1"/>
-          <w:sz w:val="24"/>
-          <w:szCs w:val="24"/>
-        </w:rPr>
-        <w:t xml:space="preserve"> </w:t>
-      </w:r>
-      <w:proofErr w:type="spellStart"/>
-      <w:r>
-        <w:rPr>
-          <w:rStyle w:val="Heading2Char"/>
-          <w:color w:val="000000" w:themeColor="dark1"/>
-          <w:sz w:val="24"/>
-          <w:szCs w:val="24"/>
-        </w:rPr>
-        <w:t>kriterijume</w:t>
-      </w:r>
-      <w:proofErr w:type="spellEnd"/>
-      <w:r>
-        <w:rPr>
-          <w:rStyle w:val="Heading2Char"/>
-          <w:color w:val="000000" w:themeColor="dark1"/>
-          <w:sz w:val="24"/>
-          <w:szCs w:val="24"/>
-        </w:rPr>
-        <w:t xml:space="preserve"> </w:t>
-      </w:r>
-      <w:proofErr w:type="spellStart"/>
-      <w:r>
-        <w:rPr>
-          <w:rStyle w:val="Heading2Char"/>
-          <w:color w:val="000000" w:themeColor="dark1"/>
-          <w:sz w:val="24"/>
-          <w:szCs w:val="24"/>
-        </w:rPr>
-        <w:t>filtriranja</w:t>
-      </w:r>
-      <w:proofErr w:type="spellEnd"/>
-      <w:r>
-        <w:rPr>
-          <w:rStyle w:val="Heading2Char"/>
-          <w:color w:val="000000" w:themeColor="dark1"/>
-          <w:sz w:val="24"/>
-          <w:szCs w:val="24"/>
-        </w:rPr>
-        <w:t>.</w:t>
+        <w:t>. Korisniku se na ekranu prikazuju komponente koje ispunjavaju kriterijume filtriranja.</w:t>
       </w:r>
       <w:bookmarkEnd w:id="20"/>
     </w:p>
@@ -5036,7 +3183,6 @@
         </w:rPr>
         <w:tab/>
       </w:r>
-      <w:proofErr w:type="spellStart"/>
       <w:r>
         <w:rPr>
           <w:rStyle w:val="Heading2Char"/>
@@ -5047,114 +3193,9 @@
           <w:szCs w:val="24"/>
           <w:u w:val="single"/>
         </w:rPr>
-        <w:t>Korisnik</w:t>
-      </w:r>
-      <w:proofErr w:type="spellEnd"/>
-      <w:r>
-        <w:rPr>
-          <w:rStyle w:val="Heading2Char"/>
-          <w:b/>
-          <w:bCs/>
-          <w:color w:val="auto"/>
-          <w:sz w:val="24"/>
-          <w:szCs w:val="24"/>
-          <w:u w:val="single"/>
-        </w:rPr>
-        <w:t xml:space="preserve"> se </w:t>
-      </w:r>
-      <w:proofErr w:type="spellStart"/>
-      <w:r>
-        <w:rPr>
-          <w:rStyle w:val="Heading2Char"/>
-          <w:b/>
-          <w:bCs/>
-          <w:color w:val="auto"/>
-          <w:sz w:val="24"/>
-          <w:szCs w:val="24"/>
-          <w:u w:val="single"/>
-        </w:rPr>
-        <w:t>odlučuje</w:t>
-      </w:r>
-      <w:proofErr w:type="spellEnd"/>
-      <w:r>
-        <w:rPr>
-          <w:rStyle w:val="Heading2Char"/>
-          <w:b/>
-          <w:bCs/>
-          <w:color w:val="auto"/>
-          <w:sz w:val="24"/>
-          <w:szCs w:val="24"/>
-          <w:u w:val="single"/>
-        </w:rPr>
-        <w:t xml:space="preserve"> </w:t>
-      </w:r>
-      <w:proofErr w:type="spellStart"/>
-      <w:r>
-        <w:rPr>
-          <w:rStyle w:val="Heading2Char"/>
-          <w:b/>
-          <w:bCs/>
-          <w:color w:val="auto"/>
-          <w:sz w:val="24"/>
-          <w:szCs w:val="24"/>
-          <w:u w:val="single"/>
-        </w:rPr>
-        <w:t>na</w:t>
-      </w:r>
-      <w:proofErr w:type="spellEnd"/>
-      <w:r>
-        <w:rPr>
-          <w:rStyle w:val="Heading2Char"/>
-          <w:b/>
-          <w:bCs/>
-          <w:color w:val="auto"/>
-          <w:sz w:val="24"/>
-          <w:szCs w:val="24"/>
-          <w:u w:val="single"/>
-        </w:rPr>
-        <w:t xml:space="preserve"> </w:t>
-      </w:r>
-      <w:proofErr w:type="spellStart"/>
-      <w:r>
-        <w:rPr>
-          <w:rStyle w:val="Heading2Char"/>
-          <w:b/>
-          <w:bCs/>
-          <w:color w:val="auto"/>
-          <w:sz w:val="24"/>
-          <w:szCs w:val="24"/>
-          <w:u w:val="single"/>
-        </w:rPr>
-        <w:t>sortiranje</w:t>
-      </w:r>
-      <w:proofErr w:type="spellEnd"/>
-      <w:r>
-        <w:rPr>
-          <w:rStyle w:val="Heading2Char"/>
-          <w:b/>
-          <w:bCs/>
-          <w:color w:val="auto"/>
-          <w:sz w:val="24"/>
-          <w:szCs w:val="24"/>
-          <w:u w:val="single"/>
-        </w:rPr>
-        <w:t xml:space="preserve"> </w:t>
-      </w:r>
-      <w:proofErr w:type="spellStart"/>
-      <w:r>
-        <w:rPr>
-          <w:rStyle w:val="Heading2Char"/>
-          <w:b/>
-          <w:bCs/>
-          <w:color w:val="auto"/>
-          <w:sz w:val="24"/>
-          <w:szCs w:val="24"/>
-          <w:u w:val="single"/>
-        </w:rPr>
-        <w:t>komponenti</w:t>
+        <w:t>Korisnik se odlučuje na sortiranje komponenti</w:t>
       </w:r>
       <w:bookmarkEnd w:id="21"/>
-      <w:proofErr w:type="spellEnd"/>
     </w:p>
     <w:p>
       <w:pPr>
@@ -5329,40 +3370,10 @@
           <w:color w:val="auto"/>
         </w:rPr>
         <w:tab/>
-      </w:r>
-      <w:proofErr w:type="spellStart"/>
-      <w:r>
-        <w:rPr>
-          <w:rStyle w:val="Heading2Char"/>
-          <w:b/>
-          <w:bCs/>
-          <w:color w:val="auto"/>
-        </w:rPr>
-        <w:t>Posebni</w:t>
-      </w:r>
-      <w:proofErr w:type="spellEnd"/>
-      <w:r>
-        <w:rPr>
-          <w:rStyle w:val="Heading2Char"/>
-          <w:b/>
-          <w:bCs/>
-          <w:color w:val="auto"/>
-        </w:rPr>
-        <w:t xml:space="preserve"> </w:t>
-      </w:r>
-      <w:proofErr w:type="spellStart"/>
-      <w:r>
-        <w:rPr>
-          <w:rStyle w:val="Heading2Char"/>
-          <w:b/>
-          <w:bCs/>
-          <w:color w:val="auto"/>
-        </w:rPr>
-        <w:t>zahtevi</w:t>
+        <w:t>Posebni zahtevi</w:t>
       </w:r>
       <w:bookmarkEnd w:id="24"/>
       <w:bookmarkEnd w:id="25"/>
-      <w:proofErr w:type="spellEnd"/>
       <w:r>
         <w:rPr>
           <w:rStyle w:val="Heading2Char"/>
@@ -5407,20 +3418,10 @@
           <w:color w:val="auto"/>
         </w:rPr>
         <w:tab/>
-      </w:r>
-      <w:proofErr w:type="spellStart"/>
-      <w:r>
-        <w:rPr>
-          <w:rStyle w:val="Heading2Char"/>
-          <w:b/>
-          <w:bCs/>
-          <w:color w:val="auto"/>
-        </w:rPr>
         <w:t>Preduslovi</w:t>
       </w:r>
       <w:bookmarkEnd w:id="26"/>
       <w:bookmarkEnd w:id="27"/>
-      <w:proofErr w:type="spellEnd"/>
       <w:r>
         <w:rPr>
           <w:rStyle w:val="Heading2Char"/>
@@ -5465,19 +3466,9 @@
           <w:color w:val="auto"/>
         </w:rPr>
         <w:tab/>
-      </w:r>
-      <w:proofErr w:type="spellStart"/>
-      <w:r>
-        <w:rPr>
-          <w:rStyle w:val="Heading2Char"/>
-          <w:b/>
-          <w:bCs/>
-          <w:color w:val="auto"/>
-        </w:rPr>
         <w:t>Posledice</w:t>
       </w:r>
       <w:bookmarkEnd w:id="28"/>
-      <w:proofErr w:type="spellEnd"/>
       <w:r>
         <w:rPr>
           <w:b/>

</xml_diff>